<commit_message>
Record frozen OpenAI live gate ablation
</commit_message>
<xml_diff>
--- a/FA_MAS_TSC_Submission_Ready_Manuscript.docx
+++ b/FA_MAS_TSC_Submission_Ready_Manuscript.docx
@@ -27,7 +27,7 @@
         <w:jc w:val="both"/>
       </w:pPr>
       <w:r>
-        <w:t>Abstract—Tool-using agents can leave duplicated, unauthorized or unresolved service effects despite plausible final answers. FA-MAS specifies contract-constrained recovery under latency, cost and state-risk limits. Its reference implementation enforces reduced gates and ranks finite recovery actions; full subgraph recomposition, calibrated diagnosis and multi-agent coordination remain proposed extensions. An original 52,500-row authored simulator uses unequal diagnosis parameters and a weaker terminal criterion, preventing causal interpretation of favorable safety contrasts. An initial 18,000-row matched exploratory study fails to demonstrate safety superiority. A further 18,000-row defect-correction study restricts compensation to existing uncertain effects, aligns selection and budgets, and counts detected unauthorized execution as unsafe. Corrected FA-MAS records 7.58% unsafe outcomes versus 9.67% without gates and 8.93% with first-feasible selection, but its difference from no-compensation is unresolved. These post-audit contrasts remain conditional on authored probabilities. Two local HTTP/SQLite implementations expose compatibility and cleanup behavior. An additional 150 direct-tool checks use 25 cancellation tasks from pinned public retail and airline code. After lost cancellation replies, reconciliation avoids repeated airline refund history; retail rejects repetition itself. These are reference-action mechanism checks, not conversational benchmark scores. A hash-locked clean dependency installation reproduces all simulator rows and public-tool traces. A bounded live-model protocol is implemented but unexecuted. The contribution is a recovery specification, executable mechanism evaluation and transparent limitations; no live-model or production advantage is claimed.</w:t>
+        <w:t>Abstract—Tool-using agents can leave duplicated, unauthorized or unresolved service effects despite plausible final answers. FA-MAS specifies contract-constrained recovery under latency, cost and state-risk limits. Its reference implementation enforces reduced gates and ranks finite recovery actions; full subgraph recomposition, calibrated diagnosis and multi-agent coordination remain proposed extensions. An original 52,500-row authored simulator uses unequal diagnosis parameters and a weaker terminal criterion, preventing causal interpretation of favorable safety contrasts. An initial 18,000-row matched exploratory study fails to demonstrate safety superiority. A further 18,000-row defect-correction study restricts compensation to existing uncertain effects, aligns selection and budgets, and counts detected unauthorized execution as unsafe. Corrected FA-MAS records 7.58% unsafe outcomes versus 9.67% without gates and 8.93% with first-feasible selection, but its difference from no-compensation is unresolved. These post-audit contrasts remain conditional on authored probabilities. Two local HTTP/SQLite implementations expose compatibility and cleanup behavior. An additional 150 direct-tool checks use 25 cancellation tasks from pinned public retail and airline code. After lost cancellation replies, reconciliation avoids repeated airline refund history; retail rejects repetition itself. These are reference-action mechanism checks, not conversational benchmark scores. A hash-locked clean dependency installation reproduces all simulator rows and public-tool traces. A bounded live gate ablation with OpenAI GPT-6 Luna completed 64 authored local-service trajectories: task success was unchanged, and the 3.125-point acceptable-outcome increase and unsafe-outcome decrease both had cluster-resampled intervals spanning zero. The contribution is a recovery specification, executable mechanism evaluation and transparent limitations; no production or broad live-model advantage is claimed.</w:t>
       </w:r>
     </w:p>
     <w:p>
@@ -116,7 +116,7 @@
         <w:jc w:val="both"/>
       </w:pPr>
       <w:r>
-        <w:t>The evidence design separates mechanism validation from model capability. The reported simulator and HTTP/SQLite service conformance suites use controlled faults with known terminal state. A separate, as yet unexecuted Tier 2 adapter harness can call pinned models to choose recovery actions in a simplified sandbox. It does not yet exercise a complete multi-agent service composition, and its scripted integration runs are not live-model results.</w:t>
+        <w:t>The evidence design separates mechanism validation from model capability. The reported simulator and HTTP/SQLite service conformance suites use controlled faults with known terminal state. A separate bounded adapter study completed one frozen OpenAI GPT-6 Luna configuration on 64 development-disjoint authored local-service trajectories. It does not exercise a complete multi-agent service composition or establish model-family, production-service, or vendor-comparison behavior.</w:t>
       </w:r>
     </w:p>
     <w:p>
@@ -226,7 +226,7 @@
         <w:jc w:val="both"/>
       </w:pPr>
       <w:r>
-        <w:t>Boundary of evidence. The prototype is an executable reference implementation. Its reported measurements establish internal consistency, paired comparison behavior, and safety–completion tradeoffs under known fault distributions. They cannot establish production readiness, model generality, or causal superiority on real services. Those claims require execution of the Tier 2 protocol in Section X.</w:t>
+        <w:t>Boundary of evidence. The prototype is an executable reference implementation. Its reported measurements establish internal consistency, paired comparison behavior, and safety–completion tradeoffs under known fault distributions. The bounded live result in Section X adds one model-in-the-loop gate ablation, but it cannot establish production readiness, model-family generality, or causal superiority on real services.</w:t>
       </w:r>
     </w:p>
     <w:p>
@@ -2664,7 +2664,7 @@
         <w:jc w:val="both"/>
       </w:pPr>
       <w:r>
-        <w:t>A local deterministic replay regenerated the 52,500-row simulator table byte for byte under Python 3.12. The audit checked paired seeds, binary metrics, missing values, and logical outcome consistency. Forty-four current unit tests cover simulator properties and both service implementations; separate auditors recompute workflow verdicts and inventory capacity invariants from stored ledgers.</w:t>
+        <w:t>A local deterministic replay regenerated the 52,500-row simulator table byte for byte under Python 3.12. The audit checked paired seeds, binary metrics, missing values, and logical outcome consistency. Fifty-two current unit tests cover simulator properties and both service implementations; separate auditors recompute workflow verdicts and inventory capacity invariants from stored ledgers.</w:t>
       </w:r>
     </w:p>
     <w:p>
@@ -2684,7 +2684,7 @@
         <w:jc w:val="both"/>
       </w:pPr>
       <w:r>
-        <w:t>Research questions. RQ1 asks whether contract-aware recovery improves completion and acceptable outcomes under controlled failures. RQ2 measures duplicate, inconsistent, or unauthorized side effects. RQ3 measures latency and cost overhead. RQ4 measures detection and localization. RQ5 examines adaptation and ablations. RQ6 defines the future live-model generality test.</w:t>
+        <w:t>Research questions. RQ1 asks whether contract-aware recovery improves completion and acceptable outcomes under controlled failures. RQ2 measures duplicate, inconsistent, or unauthorized side effects. RQ3 measures latency and cost overhead. RQ4 measures detection and localization. RQ5 examines adaptation and ablations. RQ6 evaluates whether the reduced controller accepts model-selected operations in a bounded, single-configuration live gate ablation; it does not test model generality.</w:t>
       </w:r>
     </w:p>
     <w:p>
@@ -8197,37 +8197,27 @@
         <w:jc w:val="both"/>
       </w:pPr>
       <w:r>
-        <w:t>The earlier unexecuted single-decision Tier-2 plan is retained as a historical artifact. The new bounded end-to-end protocol uses real loopback HTTP/SQLite services and lets a tool-calling model choose every operation. It specifies 32 held-out task instances, two model classes and two policies, yielding 128 trajectories with at most 12 turns each (1,536 calls). Both controllers receive the same prompt, contracts, tools, stable intent keys and budgets; FA-MAS adds prerequisite, substitute-equivalence, replacement and capture gates. No live model calls have been made.</w:t>
-      </w:r>
-    </w:p>
-    <w:p>
-      <w:pPr>
-        <w:pStyle w:val="Text"/>
-        <w:ind w:firstLine="202"/>
-        <w:jc w:val="both"/>
-      </w:pPr>
-      <w:r>
-        <w:t>The held-out instances change workflow length, SKU and capacity; they are authored variants of known fault families, not unseen production tasks. Four development tasks are disjoint. Forty-four unit tests pass and eight scripted development trajectories complete, all marked non-live. The lock covers code, task bank, model endpoints and rates, and runtime versions. Provider failures remain in the data; incomplete matrices cannot enter the live comparison. Local hashing is not independent preregistration.</w:t>
-      </w:r>
-    </w:p>
-    <w:p>
-      <w:pPr>
-        <w:pStyle w:val="Text"/>
-        <w:ind w:firstLine="202"/>
-        <w:jc w:val="both"/>
-      </w:pPr>
-      <w:r>
-        <w:t>Analysis pairs task/model cells and clusters uncertainty by the 16 service/fault families. These small authored clusters do not provide demonstrated power for small effects or population estimates. The study tests one tool-using model at a time and does not validate multi-agent coordination or the full recovery frontier. Model IDs, endpoints, credentials and an approved billing ceiling remain execution gates.</w:t>
-      </w:r>
-    </w:p>
-    <w:p>
-      <w:pPr>
-        <w:pStyle w:val="Text"/>
-        <w:ind w:firstLine="202"/>
-        <w:jc w:val="both"/>
-      </w:pPr>
-      <w:r>
-        <w:t>Planning sensitivity uses 16 clusters of four paired cells, hypothetical discordance 0.10–0.50 and intracluster correlation 0–1. A noncentral-t reference approximation gives low power for a two-percentage-point difference. These inputs are assumptions, not live estimates; the reference test differs from the planned bootstrap/sign analysis. The bank remains unsuitable for claiming adequately powered detection of modest effects. Expansion must occur before freezing, with the added service families and budget disclosed.</w:t>
+        <w:t>We conducted a bounded live-model gate-ablation study using one named configuration: OpenAI GPT-6 Luna through Chat Completions with reasoning_effort set to none and temperature 0. The model selected the operation argument of a forced generic execute_service_action tool; the runner did not script a recovery strategy. After an eight-trajectory development preflight, we froze the source, authored task bank, generic schema, request configuration, prices, and analysis plan. The one-time held-out matrix paired feature-matched recovery with FA-MAS on 32 development-disjoint authored task instances, yielding 64 trajectories with at most 12 model turns each. Both policies received the same instructions, contracts, tools, stable intent keys, budgets, local HTTP/SQLite services, injected faults, and independent terminal-state judge; FA-MAS alone applied the stated contract gates.</w:t>
+      </w:r>
+    </w:p>
+    <w:p>
+      <w:pPr>
+        <w:pStyle w:val="Text"/>
+        <w:ind w:firstLine="202"/>
+        <w:jc w:val="both"/>
+      </w:pPr>
+      <w:r>
+        <w:t>All 64 trajectories were retained: 52 reached explicit finish and 12 reached the declared turn limit, with no provider failure or budget stop. The run made 607 model requests; usage-priced cost recorded from provider token counts was USD 0.0554 against a USD 2 local ceiling. Task success was 18.75% under both policies. FA-MAS had 93.75% acceptable outcomes versus 90.625% for feature-matched recovery (paired difference +3.125 percentage points, cluster-resampled 95% interval -6.25 to +12.50) and 6.25% unsafe outcomes versus 9.375% (difference -3.125 points, interval -12.50 to +6.25). The supplementary 16-cluster sign tests, Holm-adjusted across the three endpoints, were 1.0. These intervals do not support a reliable advantage within this authored bank.</w:t>
+      </w:r>
+    </w:p>
+    <w:p>
+      <w:pPr>
+        <w:pStyle w:val="Text"/>
+        <w:ind w:firstLine="202"/>
+        <w:jc w:val="both"/>
+      </w:pPr>
+      <w:r>
+        <w:t>The task instances vary workflow length, SKU, capacity, service, and fault but are authored variants of known local fault families, not an external benchmark or production sample. One trajectory per policy-task pair does not estimate response stochasticity or disentangle model weights, provider implementation, and request settings. The evidence is a single named configuration's gate contrast; it does not compare vendors or model classes and does not validate multi-agent coordination or the proposed recovery frontier. The protocol is locally frozen, not independently preregistered.</w:t>
       </w:r>
     </w:p>
     <w:p>
@@ -8287,17 +8277,17 @@
         <w:jc w:val="both"/>
       </w:pPr>
       <w:r>
-        <w:t>Threats to validity. Internal threats include authored simulator probabilities, simplified service distributions, and baseline abstractions. Construct threats include the chosen acceptable-outcome definition and cost units. The three HTTP domain labels use the same service state machine; the workflow faults and policy rules were authored together. External threats include single-fault runs, absence of live model behavior, and simplified authorization. Statistical intervals quantify simulator sampling uncertainty, not model misspecification; deterministic conformance counts have no inferential p-values.</w:t>
-      </w:r>
-    </w:p>
-    <w:p>
-      <w:pPr>
-        <w:pStyle w:val="Text"/>
-        <w:ind w:firstLine="202"/>
-        <w:jc w:val="both"/>
-      </w:pPr>
-      <w:r>
-        <w:t>Mitigations are explicit paired designs, end-state ground truth, negative-result reporting, open artifacts, and the Tier 2 protocol. Claims remain limited to the implemented environment until that protocol is executed.</w:t>
+        <w:t>Threats to validity. Internal threats include authored simulator probabilities, simplified service distributions, and baseline abstractions. Construct threats include the chosen acceptable-outcome definition and cost units. The three HTTP domain labels use the same service state machine; the workflow faults and policy rules were authored together. External threats include single-fault runs, one named model-provider configuration, and simplified authorization. Statistical intervals quantify authored-bank uncertainty, not model misspecification or production rates.</w:t>
+      </w:r>
+    </w:p>
+    <w:p>
+      <w:pPr>
+        <w:pStyle w:val="Text"/>
+        <w:ind w:firstLine="202"/>
+        <w:jc w:val="both"/>
+      </w:pPr>
+      <w:r>
+        <w:t>Mitigations are explicit paired designs, end-state ground truth, negative-result reporting, open artifacts, and one frozen live gate ablation. Claims remain limited to the implemented environment.</w:t>
       </w:r>
     </w:p>
     <w:p>
@@ -8407,7 +8397,7 @@
         <w:jc w:val="both"/>
       </w:pPr>
       <w:r>
-        <w:t>Data availability statement. The artifact includes simulator data and scripts; the local HTTP study includes 72 single-step, 135 three-step, and 35 inventory run rows, event traces, summaries, source, and protocol digests. The Tier 2 runner and held-out task bank are supplied, but no live-model outcome is reported. No proprietary or personal dataset is used. Future live-model traces will be filtered for provider terms and sensitive content before release.</w:t>
+        <w:t>Data availability statement. The artifact includes simulator data and scripts; the local HTTP study includes 72 single-step, 135 three-step, and 35 inventory run rows, event traces, summaries, source, and protocol digests. It also includes the frozen OpenAI GPT-6 Luna live-study configuration, development preflight, execution lock, sanitized trajectory records, and analysis outputs. No proprietary or personal dataset is used. Any public release must still review provider terms and sensitive-content controls.</w:t>
       </w:r>
     </w:p>
     <w:p>
@@ -8427,7 +8417,17 @@
         <w:jc w:val="both"/>
       </w:pPr>
       <w:r>
-        <w:t>Clean-install verification. A fresh virtual environment installs all 29 required distributions from binary wheels using SHA-256 enforcement, without inheriting site packages. Forty-four tests pass; 52,500 historical rows, the initial 18,000 matched rows and 18,000 corrected rows replay byte for byte. All 150 public-tool traces also reproduce byte for byte. This is isolated installation on the same host and interpreter build, not independent third-party replication. The lock is platform-specific and does not lock manuscript rendering dependencies. The upstream source commit, loaded files, data and MIT notice are preserved.</w:t>
+        <w:t>The live-study records bind the passed development preflight, frozen configuration, lock, execution-start marker, raw sanitized trajectories, manifest, and independent terminal-state analysis to the same protocol digest. The execution is reproducible only with legitimate model access and may differ as the provider serves the named model over time. Independent replication remains absent.</w:t>
+      </w:r>
+    </w:p>
+    <w:p>
+      <w:pPr>
+        <w:pStyle w:val="Text"/>
+        <w:ind w:firstLine="202"/>
+        <w:jc w:val="both"/>
+      </w:pPr>
+      <w:r>
+        <w:t>Clean-install verification. A fresh virtual environment installs all 29 required distributions from binary wheels using SHA-256 enforcement, without inheriting site packages. The recorded clean-install audit passed 44 tests; the current source suite has 52 tests. The 52,500 historical rows, initial 18,000 matched rows, corrected 18,000 rows, and all 150 public-tool traces replay byte for byte. This is isolated installation on the same host and interpreter build, not independent third-party replication. The lock is platform-specific and does not lock manuscript rendering dependencies. The upstream source commit, loaded files, data and MIT notice are preserved.</w:t>
       </w:r>
     </w:p>
     <w:p>
@@ -8447,7 +8447,7 @@
         <w:jc w:val="both"/>
       </w:pPr>
       <w:r>
-        <w:t>Artifact claims must match contents. The current package supports the reduced simulator, finite-action Pareto selection, two local services, and an unexecuted bounded live-study runner. It does not implement the complete production architecture. The data statement should name synthetic data and authored probabilities. If the artifact is reviewed anonymously, repository metadata, package authors, paths, and document properties must be scrubbed without changing executable content; otherwise the public release should preserve authorship and version history.</w:t>
+        <w:t>Artifact claims must match contents. The current package supports the reduced simulator, finite-action Pareto selection, two local services, and one frozen named-configuration live gate ablation. It does not implement the complete production architecture. The data statement should name synthetic data and authored probabilities. If the artifact is reviewed anonymously, repository metadata, package authors, paths, and document properties must be scrubbed without changing executable content; otherwise the public release should preserve authorship and version history.</w:t>
       </w:r>
     </w:p>
     <w:p>
@@ -8477,7 +8477,7 @@
         <w:jc w:val="both"/>
       </w:pPr>
       <w:r>
-        <w:t>FA-MAS reframes reliable agent execution as constrained recovery of a stateful service composition. The design combines contracts, failure-belief estimation, a proposed recomposition frontier and compensation-aware state recovery. Only reduced gates, finite-action selection and local service state are currently executable. The original simulator favors FA-MAS on recorded safety under unequal authored diagnosis parameters. The initial matched study is negative. After disclosed defect corrections, the exploratory simulator favors gated selection over two controls but shows no resolved benefit from compensation; orphan-state failures persist. No live-model advantage has been measured.</w:t>
+        <w:t>FA-MAS reframes reliable agent execution as constrained recovery of a stateful service composition. The design combines contracts, failure-belief estimation, a proposed recomposition frontier and compensation-aware state recovery. Only reduced gates, finite-action selection and local service state are currently executable. The original simulator favors FA-MAS on recorded safety under unequal authored diagnosis parameters. The initial matched study is negative. After disclosed defect corrections, the exploratory simulator favors gated selection over two controls but shows no resolved benefit from compensation; orphan-state failures persist. The bounded live gate ablation yields no task-success difference and inconclusive acceptable-outcome and unsafe-outcome contrasts.</w:t>
       </w:r>
     </w:p>
     <w:p>
@@ -8497,7 +8497,7 @@
         <w:jc w:val="both"/>
       </w:pPr>
       <w:r>
-        <w:t>The paper's defensible contribution is a reference specification and transparent mechanism evaluation; the matched and corrected sensitivity studies prevent an unconditional claim of safety superiority. It is a services-computing control architecture, formal objective, executable recovery protocol, and reproducible fault-injection methodology. Completion of the prespecified live-model protocol would strengthen external validity without changing the contract and state semantics evaluated here.</w:t>
+        <w:t>The paper's defensible contribution is a reference specification and transparent mechanism evaluation; the matched and corrected sensitivity studies and the bounded live contrast prevent an unconditional claim of safety superiority. It is a services-computing control architecture, formal objective, executable recovery protocol, and reproducible fault-injection methodology. Further service families, repeated sampling, and independently reproduced live runs would be needed to strengthen external validity.</w:t>
       </w:r>
     </w:p>
     <w:p>
@@ -8557,7 +8557,7 @@
         <w:jc w:val="both"/>
       </w:pPr>
       <w:r>
-        <w:t>Supported with limitations: the reference simulator implements the reduced contract fields and recovery actions described in Section VII; it generated the reported observations; historical paired comparisons reproduce the recorded effects under unequal authored parameters and a weaker terminal judge. The initial matched exploratory study is negative; the corrected study remains conditional and does not establish production or live-model superiority. The artifact also implements the Tier 2 adapters, task split, protocol lock, transactional judge, trace hashing, and analysis gate. Not supported: full implementation of every architectural field, production readiness, exactly-once execution for arbitrary providers, universal model superiority, or live-LLM generality before Tier 2 execution.</w:t>
+        <w:t>Supported with limitations: the reference simulator implements the reduced contract fields and recovery actions described in Section VII; it generated the reported observations; historical paired comparisons reproduce the recorded effects under unequal authored parameters and a weaker terminal judge. The initial matched exploratory study is negative; the corrected study remains conditional and does not establish production superiority. The artifact also implements a frozen one-configuration live gate ablation with a transactional judge, trace hashing, and an analysis gate. Not supported: full implementation of every architectural field, production readiness, exactly-once execution for arbitrary providers, universal model superiority, or general live-LLM behavior.</w:t>
       </w:r>
     </w:p>
     <w:p>

</xml_diff>